<commit_message>
update 2 report form
</commit_message>
<xml_diff>
--- a/ฟอร์มรายงานผล/Word/ปรสิตวิทยา/รายงานผล Parasite_blood.docx
+++ b/ฟอร์มรายงานผล/Word/ปรสิตวิทยา/รายงานผล Parasite_blood.docx
@@ -36,7 +36,7 @@
           <w:p>
             <w:pPr>
               <w:rPr>
-                <w:rFonts w:ascii="TH SarabunPSK" w:hAnsi="TH SarabunPSK" w:cs="TH SarabunPSK"/>
+                <w:rFonts w:ascii="TH SarabunPSK" w:hAnsi="TH SarabunPSK" w:cs="TH SarabunPSK" w:hint="cs"/>
                 <w:sz w:val="32"/>
                 <w:szCs w:val="32"/>
                 <w:cs/>
@@ -44,43 +44,19 @@
             </w:pPr>
             <w:r>
               <w:rPr>
-                <w:rFonts w:ascii="TH SarabunPSK" w:hAnsi="TH SarabunPSK" w:cs="TH SarabunPSK" w:hint="cs"/>
+                <w:rFonts w:ascii="TH SarabunPSK" w:hAnsi="TH SarabunPSK"/>
                 <w:b/>
                 <w:bCs/>
                 <w:sz w:val="32"/>
-                <w:szCs w:val="32"/>
-                <w:cs/>
-              </w:rPr>
-              <w:t xml:space="preserve"> </w:t>
+              </w:rPr>
+              <w:t xml:space="preserve"> เลขที่รายงาน:</w:t>
             </w:r>
             <w:r>
               <w:rPr>
-                <w:rFonts w:ascii="TH SarabunPSK" w:hAnsi="TH SarabunPSK" w:cs="TH SarabunPSK"/>
-                <w:b/>
-                <w:bCs/>
-                <w:sz w:val="32"/>
-                <w:szCs w:val="32"/>
-                <w:cs/>
-              </w:rPr>
-              <w:t>เลขที่รายงาน</w:t>
-            </w:r>
-            <w:r>
-              <w:rPr>
-                <w:rFonts w:ascii="TH SarabunPSK" w:hAnsi="TH SarabunPSK" w:cs="TH SarabunPSK"/>
-                <w:b/>
-                <w:bCs/>
-                <w:sz w:val="32"/>
-                <w:szCs w:val="32"/>
-              </w:rPr>
-              <w:t>:</w:t>
-            </w:r>
-            <w:r>
-              <w:rPr>
-                <w:rFonts w:ascii="TH SarabunPSK" w:hAnsi="TH SarabunPSK" w:cs="TH SarabunPSK"/>
-                <w:sz w:val="32"/>
-                <w:szCs w:val="32"/>
-              </w:rPr>
-              <w:t xml:space="preserve"> </w:t>
+                <w:rFonts w:ascii="TH SarabunPSK" w:hAnsi="TH SarabunPSK"/>
+                <w:sz w:val="32"/>
+              </w:rPr>
+              <w:t xml:space="preserve"> {{เลขที่รายงาน}}</w:t>
             </w:r>
           </w:p>
         </w:tc>
@@ -103,35 +79,19 @@
             </w:pPr>
             <w:r>
               <w:rPr>
-                <w:rFonts w:ascii="TH SarabunPSK" w:hAnsi="TH SarabunPSK" w:cs="TH SarabunPSK"/>
+                <w:rFonts w:ascii="TH SarabunPSK" w:hAnsi="TH SarabunPSK"/>
                 <w:b/>
                 <w:bCs/>
                 <w:sz w:val="32"/>
-                <w:szCs w:val="32"/>
-                <w:cs/>
-              </w:rPr>
-              <w:t>เลขที่ตัวอย่าง</w:t>
+              </w:rPr>
+              <w:t>เลขที่ตัวอย่าง:</w:t>
             </w:r>
             <w:r>
               <w:rPr>
-                <w:rFonts w:ascii="TH SarabunPSK" w:hAnsi="TH SarabunPSK" w:cs="TH SarabunPSK"/>
-                <w:b/>
-                <w:bCs/>
-                <w:sz w:val="32"/>
-                <w:szCs w:val="32"/>
-              </w:rPr>
-              <w:t>:</w:t>
-            </w:r>
-            <w:r>
-              <w:rPr>
-                <w:rFonts w:ascii="TH SarabunPSK" w:hAnsi="TH SarabunPSK" w:cs="TH SarabunPSK"/>
-                <w:b/>
-                <w:bCs/>
-                <w:sz w:val="32"/>
-                <w:szCs w:val="32"/>
-                <w:cs/>
-              </w:rPr>
-              <w:t xml:space="preserve">   </w:t>
+                <w:rFonts w:ascii="TH SarabunPSK" w:hAnsi="TH SarabunPSK"/>
+                <w:sz w:val="32"/>
+              </w:rPr>
+              <w:t xml:space="preserve"> {{เลขที่ตัวอย่าง}}  </w:t>
             </w:r>
           </w:p>
         </w:tc>
@@ -229,54 +189,19 @@
             </w:pPr>
             <w:r>
               <w:rPr>
-                <w:rFonts w:ascii="TH SarabunPSK" w:hAnsi="TH SarabunPSK" w:cs="TH SarabunPSK"/>
+                <w:rFonts w:ascii="TH SarabunPSK" w:hAnsi="TH SarabunPSK"/>
                 <w:b/>
                 <w:bCs/>
                 <w:sz w:val="32"/>
-                <w:szCs w:val="32"/>
-                <w:cs/>
-              </w:rPr>
-              <w:t>วันที่รับตัวอย่าง</w:t>
+              </w:rPr>
+              <w:t>วันที่รับตัวอย่าง:</w:t>
             </w:r>
             <w:r>
               <w:rPr>
-                <w:rFonts w:ascii="TH SarabunPSK" w:hAnsi="TH SarabunPSK" w:cs="TH SarabunPSK"/>
-                <w:b/>
-                <w:bCs/>
-                <w:sz w:val="32"/>
-                <w:szCs w:val="32"/>
-              </w:rPr>
-              <w:t>:</w:t>
-            </w:r>
-            <w:r>
-              <w:rPr>
-                <w:rFonts w:ascii="TH SarabunPSK" w:hAnsi="TH SarabunPSK" w:cs="TH SarabunPSK"/>
-                <w:b/>
-                <w:bCs/>
-                <w:sz w:val="32"/>
-                <w:szCs w:val="32"/>
-                <w:cs/>
-              </w:rPr>
-              <w:t xml:space="preserve">   </w:t>
-            </w:r>
-            <w:r>
-              <w:rPr>
-                <w:rFonts w:ascii="TH SarabunPSK" w:hAnsi="TH SarabunPSK" w:cs="TH SarabunPSK"/>
-                <w:sz w:val="32"/>
-                <w:szCs w:val="32"/>
-                <w:cs/>
-              </w:rPr>
-              <w:t xml:space="preserve">   </w:t>
-            </w:r>
-            <w:r>
-              <w:rPr>
-                <w:rFonts w:ascii="TH SarabunPSK" w:hAnsi="TH SarabunPSK" w:cs="TH SarabunPSK"/>
-                <w:b/>
-                <w:bCs/>
-                <w:sz w:val="32"/>
-                <w:szCs w:val="32"/>
-              </w:rPr>
-              <w:t xml:space="preserve"> </w:t>
+                <w:rFonts w:ascii="TH SarabunPSK" w:hAnsi="TH SarabunPSK"/>
+                <w:sz w:val="32"/>
+              </w:rPr>
+              <w:t xml:space="preserve"> {{วันที่รับตัวอย่าง}}  </w:t>
             </w:r>
           </w:p>
         </w:tc>
@@ -300,52 +225,19 @@
             </w:pPr>
             <w:r>
               <w:rPr>
-                <w:rFonts w:ascii="TH SarabunPSK" w:hAnsi="TH SarabunPSK" w:cs="TH SarabunPSK"/>
+                <w:rFonts w:ascii="TH SarabunPSK" w:hAnsi="TH SarabunPSK"/>
                 <w:b/>
                 <w:bCs/>
                 <w:sz w:val="32"/>
-                <w:szCs w:val="32"/>
-                <w:cs/>
-              </w:rPr>
-              <w:t>วันที่เริ่มทดสอบ</w:t>
+              </w:rPr>
+              <w:t>วันที่เริ่มทดสอบ:</w:t>
             </w:r>
             <w:r>
               <w:rPr>
-                <w:rFonts w:ascii="TH SarabunPSK" w:hAnsi="TH SarabunPSK" w:cs="TH SarabunPSK"/>
-                <w:b/>
-                <w:bCs/>
-                <w:sz w:val="32"/>
-                <w:szCs w:val="32"/>
-              </w:rPr>
-              <w:t>:</w:t>
-            </w:r>
-            <w:r>
-              <w:rPr>
-                <w:rFonts w:ascii="TH SarabunPSK" w:hAnsi="TH SarabunPSK" w:cs="TH SarabunPSK"/>
-                <w:b/>
-                <w:bCs/>
-                <w:sz w:val="32"/>
-                <w:szCs w:val="32"/>
-                <w:cs/>
-              </w:rPr>
-              <w:t xml:space="preserve">   </w:t>
-            </w:r>
-            <w:r>
-              <w:rPr>
-                <w:rFonts w:ascii="TH SarabunPSK" w:hAnsi="TH SarabunPSK" w:cs="TH SarabunPSK"/>
-                <w:sz w:val="32"/>
-                <w:szCs w:val="32"/>
-                <w:cs/>
-              </w:rPr>
-              <w:t xml:space="preserve">    </w:t>
-            </w:r>
-            <w:r>
-              <w:rPr>
-                <w:rFonts w:ascii="TH SarabunPSK" w:hAnsi="TH SarabunPSK" w:cs="TH SarabunPSK"/>
-                <w:sz w:val="32"/>
-                <w:szCs w:val="32"/>
-              </w:rPr>
-              <w:t xml:space="preserve">  </w:t>
+                <w:rFonts w:ascii="TH SarabunPSK" w:hAnsi="TH SarabunPSK"/>
+                <w:sz w:val="32"/>
+              </w:rPr>
+              <w:t xml:space="preserve"> {{วันที่เริ่มทดสอบ}}</w:t>
             </w:r>
           </w:p>
         </w:tc>
@@ -368,52 +260,19 @@
             </w:pPr>
             <w:r>
               <w:rPr>
-                <w:rFonts w:ascii="TH SarabunPSK" w:hAnsi="TH SarabunPSK" w:cs="TH SarabunPSK"/>
+                <w:rFonts w:ascii="TH SarabunPSK" w:hAnsi="TH SarabunPSK"/>
                 <w:b/>
                 <w:bCs/>
                 <w:sz w:val="32"/>
-                <w:szCs w:val="32"/>
-                <w:cs/>
-              </w:rPr>
-              <w:t>วันที่ตอบผล</w:t>
+              </w:rPr>
+              <w:t>วันที่ตอบผล:</w:t>
             </w:r>
             <w:r>
               <w:rPr>
-                <w:rFonts w:ascii="TH SarabunPSK" w:hAnsi="TH SarabunPSK" w:cs="TH SarabunPSK"/>
-                <w:b/>
-                <w:bCs/>
-                <w:sz w:val="32"/>
-                <w:szCs w:val="32"/>
-              </w:rPr>
-              <w:t>:</w:t>
-            </w:r>
-            <w:r>
-              <w:rPr>
-                <w:rFonts w:ascii="TH SarabunPSK" w:hAnsi="TH SarabunPSK" w:cs="TH SarabunPSK"/>
-                <w:b/>
-                <w:bCs/>
-                <w:sz w:val="32"/>
-                <w:szCs w:val="32"/>
-                <w:cs/>
-              </w:rPr>
-              <w:t xml:space="preserve">   </w:t>
-            </w:r>
-            <w:r>
-              <w:rPr>
-                <w:rFonts w:ascii="TH SarabunPSK" w:hAnsi="TH SarabunPSK" w:cs="TH SarabunPSK"/>
-                <w:sz w:val="32"/>
-                <w:szCs w:val="32"/>
-                <w:cs/>
-              </w:rPr>
-              <w:t xml:space="preserve">  </w:t>
-            </w:r>
-            <w:r>
-              <w:rPr>
-                <w:rFonts w:ascii="TH SarabunPSK" w:hAnsi="TH SarabunPSK" w:cs="TH SarabunPSK"/>
-                <w:sz w:val="32"/>
-                <w:szCs w:val="32"/>
-              </w:rPr>
-              <w:t xml:space="preserve">  </w:t>
+                <w:rFonts w:ascii="TH SarabunPSK" w:hAnsi="TH SarabunPSK"/>
+                <w:sz w:val="32"/>
+              </w:rPr>
+              <w:t xml:space="preserve"> </w:t>
             </w:r>
           </w:p>
         </w:tc>
@@ -533,7 +392,7 @@
                   <w:r>
                     <w:rPr>
                       <w:rFonts w:ascii="TH SarabunPSK" w:hAnsi="TH SarabunPSK" w:cs="TH SarabunPSK"/>
-                      <w:sz w:val="28"/>
+                      <w:sz w:val="32"/>
                     </w:rPr>
                     <w:t>No.</w:t>
                   </w:r>
@@ -558,7 +417,7 @@
                   <w:r>
                     <w:rPr>
                       <w:rFonts w:ascii="TH SarabunPSK" w:hAnsi="TH SarabunPSK" w:cs="TH SarabunPSK"/>
-                      <w:sz w:val="28"/>
+                      <w:sz w:val="32"/>
                     </w:rPr>
                     <w:t>Animal name</w:t>
                   </w:r>
@@ -583,7 +442,7 @@
                   <w:r>
                     <w:rPr>
                       <w:rFonts w:ascii="TH SarabunPSK" w:hAnsi="TH SarabunPSK" w:cs="TH SarabunPSK"/>
-                      <w:sz w:val="28"/>
+                      <w:sz w:val="32"/>
                     </w:rPr>
                     <w:t>Blood parasite</w:t>
                   </w:r>
@@ -608,7 +467,7 @@
                   <w:r>
                     <w:rPr>
                       <w:rFonts w:ascii="TH SarabunPSK" w:hAnsi="TH SarabunPSK" w:cs="TH SarabunPSK"/>
-                      <w:sz w:val="28"/>
+                      <w:sz w:val="32"/>
                     </w:rPr>
                     <w:t>PCV (%)</w:t>
                   </w:r>
@@ -633,7 +492,7 @@
                   <w:r>
                     <w:rPr>
                       <w:rFonts w:ascii="TH SarabunPSK" w:hAnsi="TH SarabunPSK" w:cs="TH SarabunPSK"/>
-                      <w:sz w:val="28"/>
+                      <w:sz w:val="32"/>
                     </w:rPr>
                     <w:t>Other…</w:t>
                   </w:r>
@@ -710,7 +569,7 @@
                   <w:r>
                     <w:rPr>
                       <w:rFonts w:ascii="TH SarabunPSK" w:hAnsi="TH SarabunPSK" w:cs="TH SarabunPSK"/>
-                      <w:sz w:val="28"/>
+                      <w:sz w:val="32"/>
                     </w:rPr>
                     <w:t>Stain thin smear</w:t>
                   </w:r>
@@ -735,7 +594,7 @@
                   <w:r>
                     <w:rPr>
                       <w:rFonts w:ascii="TH SarabunPSK" w:hAnsi="TH SarabunPSK" w:cs="TH SarabunPSK"/>
-                      <w:sz w:val="28"/>
+                      <w:sz w:val="32"/>
                     </w:rPr>
                     <w:t>Woo’s technique</w:t>
                   </w:r>
@@ -802,7 +661,7 @@
                   <w:r>
                     <w:rPr>
                       <w:rFonts w:ascii="TH SarabunPSK" w:hAnsi="TH SarabunPSK" w:cs="TH SarabunPSK" w:hint="cs"/>
-                      <w:sz w:val="28"/>
+                      <w:sz w:val="32"/>
                       <w:szCs w:val="28"/>
                       <w:cs/>
                     </w:rPr>
@@ -820,6 +679,8 @@
                     <w:framePr w:hSpace="180" w:wrap="around" w:vAnchor="text" w:hAnchor="margin" w:xAlign="center" w:y="228"/>
                     <w:rPr>
                       <w:rFonts w:ascii="TH SarabunPSK" w:hAnsi="TH SarabunPSK" w:cs="TH SarabunPSK"/>
+                      <w:b/>
+                      <w:bCs/>
                       <w:sz w:val="28"/>
                       <w:szCs w:val="28"/>
                     </w:rPr>
@@ -838,6 +699,8 @@
                     <w:jc w:val="center"/>
                     <w:rPr>
                       <w:rFonts w:ascii="TH SarabunPSK" w:hAnsi="TH SarabunPSK" w:cs="TH SarabunPSK"/>
+                      <w:b/>
+                      <w:bCs/>
                       <w:sz w:val="28"/>
                       <w:szCs w:val="28"/>
                     </w:rPr>
@@ -855,6 +718,8 @@
                     <w:jc w:val="center"/>
                     <w:rPr>
                       <w:rFonts w:ascii="TH SarabunPSK" w:hAnsi="TH SarabunPSK" w:cs="TH SarabunPSK"/>
+                      <w:b/>
+                      <w:bCs/>
                       <w:sz w:val="28"/>
                       <w:szCs w:val="28"/>
                     </w:rPr>
@@ -873,6 +738,8 @@
                     <w:jc w:val="center"/>
                     <w:rPr>
                       <w:rFonts w:ascii="TH SarabunPSK" w:hAnsi="TH SarabunPSK" w:cs="TH SarabunPSK"/>
+                      <w:b/>
+                      <w:bCs/>
                       <w:sz w:val="28"/>
                       <w:szCs w:val="28"/>
                     </w:rPr>
@@ -898,7 +765,7 @@
                   <w:r>
                     <w:rPr>
                       <w:rFonts w:ascii="TH SarabunPSK" w:hAnsi="TH SarabunPSK" w:cs="TH SarabunPSK" w:hint="cs"/>
-                      <w:sz w:val="28"/>
+                      <w:sz w:val="32"/>
                       <w:szCs w:val="28"/>
                       <w:cs/>
                     </w:rPr>
@@ -957,7 +824,7 @@
             <w:r>
               <w:rPr>
                 <w:rFonts w:ascii="TH SarabunPSK" w:hAnsi="TH SarabunPSK" w:cs="TH SarabunPSK"/>
-                <w:sz w:val="24"/>
+                <w:sz w:val="32"/>
                 <w:szCs w:val="24"/>
               </w:rPr>
               <w:t xml:space="preserve">      NF = </w:t>
@@ -965,7 +832,7 @@
             <w:r>
               <w:rPr>
                 <w:rFonts w:ascii="TH SarabunPSK" w:hAnsi="TH SarabunPSK" w:cs="TH SarabunPSK"/>
-                <w:sz w:val="24"/>
+                <w:sz w:val="32"/>
                 <w:szCs w:val="24"/>
               </w:rPr>
               <w:t>N</w:t>
@@ -973,7 +840,7 @@
             <w:r>
               <w:rPr>
                 <w:rFonts w:ascii="TH SarabunPSK" w:hAnsi="TH SarabunPSK" w:cs="TH SarabunPSK"/>
-                <w:sz w:val="24"/>
+                <w:sz w:val="32"/>
                 <w:szCs w:val="24"/>
               </w:rPr>
               <w:t>ot found</w:t>
@@ -1007,7 +874,7 @@
                 <w:rFonts w:ascii="TH SarabunPSK" w:hAnsi="TH SarabunPSK" w:cs="TH SarabunPSK"/>
                 <w:b/>
                 <w:bCs/>
-                <w:sz w:val="28"/>
+                <w:sz w:val="32"/>
                 <w:szCs w:val="28"/>
                 <w:cs/>
               </w:rPr>
@@ -1016,7 +883,7 @@
             <w:r>
               <w:rPr>
                 <w:rFonts w:ascii="TH SarabunPSK" w:hAnsi="TH SarabunPSK" w:cs="TH SarabunPSK" w:hint="cs"/>
-                <w:sz w:val="40"/>
+                <w:sz w:val="32"/>
                 <w:szCs w:val="28"/>
                 <w:cs/>
               </w:rPr>
@@ -3002,11 +2869,10 @@
 <file path=word/glossary/fontTable.xml><?xml version="1.0" encoding="utf-8"?>
 <w:fonts xmlns:mc="http://schemas.openxmlformats.org/markup-compatibility/2006" xmlns:r="http://schemas.openxmlformats.org/officeDocument/2006/relationships" xmlns:w="http://schemas.openxmlformats.org/wordprocessingml/2006/main" xmlns:w14="http://schemas.microsoft.com/office/word/2010/wordml" xmlns:w15="http://schemas.microsoft.com/office/word/2012/wordml" xmlns:w16cex="http://schemas.microsoft.com/office/word/2018/wordml/cex" xmlns:w16cid="http://schemas.microsoft.com/office/word/2016/wordml/cid" xmlns:w16="http://schemas.microsoft.com/office/word/2018/wordml" xmlns:w16du="http://schemas.microsoft.com/office/word/2023/wordml/word16du" xmlns:w16sdtdh="http://schemas.microsoft.com/office/word/2020/wordml/sdtdatahash" xmlns:w16sdtfl="http://schemas.microsoft.com/office/word/2024/wordml/sdtformatlock" xmlns:w16se="http://schemas.microsoft.com/office/word/2015/wordml/symex" mc:Ignorable="w14 w15 w16se w16cid w16 w16cex w16sdtdh w16sdtfl w16du">
   <w:font w:name="TH SarabunPSK">
-    <w:panose1 w:val="020B0500040200020003"/>
-    <w:charset w:val="00"/>
+    <w:charset w:val="DE"/>
     <w:family w:val="swiss"/>
     <w:pitch w:val="variable"/>
-    <w:sig w:usb0="A100006F" w:usb1="5000205A" w:usb2="00000000" w:usb3="00000000" w:csb0="00010183" w:csb1="00000000"/>
+    <w:sig w:usb0="01000003" w:usb1="00000000" w:usb2="00000000" w:usb3="00000000" w:csb0="00010111" w:csb1="00000000"/>
   </w:font>
   <w:font w:name="Times New Roman">
     <w:panose1 w:val="02020603050405020304"/>
@@ -3137,6 +3003,7 @@
     <w:rsid w:val="008D0E20"/>
     <w:rsid w:val="008D2DA1"/>
     <w:rsid w:val="0094265F"/>
+    <w:rsid w:val="00982215"/>
     <w:rsid w:val="00986496"/>
     <w:rsid w:val="009C3775"/>
     <w:rsid w:val="00A0691E"/>
@@ -3145,12 +3012,14 @@
     <w:rsid w:val="00A65FC9"/>
     <w:rsid w:val="00A9791A"/>
     <w:rsid w:val="00AE3C2D"/>
+    <w:rsid w:val="00B00EB1"/>
     <w:rsid w:val="00B00FA2"/>
     <w:rsid w:val="00B314BD"/>
     <w:rsid w:val="00B530E9"/>
     <w:rsid w:val="00B820F8"/>
     <w:rsid w:val="00BA6914"/>
     <w:rsid w:val="00BC0395"/>
+    <w:rsid w:val="00BE41F8"/>
     <w:rsid w:val="00C30016"/>
     <w:rsid w:val="00CC6067"/>
     <w:rsid w:val="00CD5938"/>
@@ -3175,6 +3044,7 @@
     <w:rsid w:val="00F10D0E"/>
     <w:rsid w:val="00F24F93"/>
     <w:rsid w:val="00F27DD7"/>
+    <w:rsid w:val="00FA0FDE"/>
     <w:rsid w:val="00FC48A3"/>
     <w:rsid w:val="00FF55D0"/>
   </w:rsids>

</xml_diff>